<commit_message>
Add real team names to all documents
EBODE ADA ERIKA ALEXANDRA (ICTU20233909) — Team Leader
AJA CHELLA ASAMBA JR (ICTU20233787) — Developer & DevOps

Updated: FINAL_REPORT.md, README.md, SCRUM_REPORT.md,
all 4 Word document cover pages, PPTX title slide
</commit_message>
<xml_diff>
--- a/08_Architecture/MindBridge_SAD.docx
+++ b/08_Architecture/MindBridge_SAD.docx
@@ -129,7 +129,7 @@
     </w:p>
     <w:p>
       <w:pPr>
-        <w:spacing w:after="120" w:before="0"/>
+        <w:spacing w:after="40" w:before="0"/>
         <w:jc w:val="right"/>
       </w:pPr>
       <w:r>
@@ -141,7 +141,58 @@
           <w:sz w:val="26"/>
           <w:szCs w:val="26"/>
         </w:rPr>
-        <w:t xml:space="preserve">MindBridge Development Team</w:t>
+        <w:t xml:space="preserve">EBODE ADA ERIKA ALEXANDRA</w:t>
+      </w:r>
+    </w:p>
+    <w:p>
+      <w:pPr>
+        <w:spacing w:after="100" w:before="0"/>
+        <w:jc w:val="right"/>
+      </w:pPr>
+      <w:r>
+        <w:rPr>
+          <w:rFonts w:ascii="Georgia" w:cs="Georgia" w:eastAsia="Georgia" w:hAnsi="Georgia"/>
+          <w:i/>
+          <w:iCs/>
+          <w:color w:val="000000"/>
+          <w:sz w:val="21"/>
+          <w:szCs w:val="21"/>
+        </w:rPr>
+        <w:t xml:space="preserve">Matricule: ICTU20233909  —  Team Leader</w:t>
+      </w:r>
+    </w:p>
+    <w:p>
+      <w:pPr>
+        <w:spacing w:after="40" w:before="0"/>
+        <w:jc w:val="right"/>
+      </w:pPr>
+      <w:r>
+        <w:rPr>
+          <w:rFonts w:ascii="Georgia" w:cs="Georgia" w:eastAsia="Georgia" w:hAnsi="Georgia"/>
+          <w:b/>
+          <w:bCs/>
+          <w:color w:val="1B2A4A"/>
+          <w:sz w:val="26"/>
+          <w:szCs w:val="26"/>
+        </w:rPr>
+        <w:t xml:space="preserve">AJA CHELLA ASAMBA JR</w:t>
+      </w:r>
+    </w:p>
+    <w:p>
+      <w:pPr>
+        <w:spacing w:after="140" w:before="0"/>
+        <w:jc w:val="right"/>
+      </w:pPr>
+      <w:r>
+        <w:rPr>
+          <w:rFonts w:ascii="Georgia" w:cs="Georgia" w:eastAsia="Georgia" w:hAnsi="Georgia"/>
+          <w:i/>
+          <w:iCs/>
+          <w:color w:val="000000"/>
+          <w:sz w:val="21"/>
+          <w:szCs w:val="21"/>
+        </w:rPr>
+        <w:t xml:space="preserve">Matricule: ICTU20233787  —  Developer &amp; DevOps</w:t>
       </w:r>
     </w:p>
     <w:p>

</xml_diff>